<commit_message>
pygame: 와 ! 신 난 다 !
</commit_message>
<xml_diff>
--- a/practice/data/theory/jungol/01_초등/3주차/2026년_3차_초등_숙제_교사용_2019-2025.docx
+++ b/practice/data/theory/jungol/01_초등/3주차/2026년_3차_초등_숙제_교사용_2019-2025.docx
@@ -1,6 +1,6 @@
 
 <file path=word/document.xml><?xml version="1.0" encoding="utf-8"?>
-<w:document xmlns:wpc="http://schemas.microsoft.com/office/word/2010/wordprocessingCanvas" xmlns:cx="http://schemas.microsoft.com/office/drawing/2014/chartex" xmlns:cx1="http://schemas.microsoft.com/office/drawing/2015/9/8/chartex" xmlns:mc="http://schemas.openxmlformats.org/markup-compatibility/2006" xmlns:o="urn:schemas-microsoft-com:office:office" xmlns:r="http://schemas.openxmlformats.org/officeDocument/2006/relationships" xmlns:m="http://schemas.openxmlformats.org/officeDocument/2006/math" xmlns:v="urn:schemas-microsoft-com:vml" xmlns:wp14="http://schemas.microsoft.com/office/word/2010/wordprocessingDrawing" xmlns:wp="http://schemas.openxmlformats.org/drawingml/2006/wordprocessingDrawing" xmlns:w10="urn:schemas-microsoft-com:office:word" xmlns:w="http://schemas.openxmlformats.org/wordprocessingml/2006/main" xmlns:w14="http://schemas.microsoft.com/office/word/2010/wordml" xmlns:w15="http://schemas.microsoft.com/office/word/2012/wordml" xmlns:w16se="http://schemas.microsoft.com/office/word/2015/wordml/symex" xmlns:wpg="http://schemas.microsoft.com/office/word/2010/wordprocessingGroup" xmlns:wpi="http://schemas.microsoft.com/office/word/2010/wordprocessingInk" xmlns:wne="http://schemas.microsoft.com/office/word/2006/wordml" xmlns:wps="http://schemas.microsoft.com/office/word/2010/wordprocessingShape" mc:Ignorable="w14 w15 w16se wp14">
+<w:document xmlns:wpc="http://schemas.microsoft.com/office/word/2010/wordprocessingCanvas" xmlns:cx="http://schemas.microsoft.com/office/drawing/2014/chartex" xmlns:mc="http://schemas.openxmlformats.org/markup-compatibility/2006" xmlns:o="urn:schemas-microsoft-com:office:office" xmlns:r="http://schemas.openxmlformats.org/officeDocument/2006/relationships" xmlns:m="http://schemas.openxmlformats.org/officeDocument/2006/math" xmlns:v="urn:schemas-microsoft-com:vml" xmlns:wp14="http://schemas.microsoft.com/office/word/2010/wordprocessingDrawing" xmlns:wp="http://schemas.openxmlformats.org/drawingml/2006/wordprocessingDrawing" xmlns:w10="urn:schemas-microsoft-com:office:word" xmlns:w="http://schemas.openxmlformats.org/wordprocessingml/2006/main" xmlns:w14="http://schemas.microsoft.com/office/word/2010/wordml" xmlns:w15="http://schemas.microsoft.com/office/word/2012/wordml" xmlns:w16se="http://schemas.microsoft.com/office/word/2015/wordml/symex" xmlns:wpg="http://schemas.microsoft.com/office/word/2010/wordprocessingGroup" xmlns:wpi="http://schemas.microsoft.com/office/word/2010/wordprocessingInk" xmlns:wne="http://schemas.microsoft.com/office/word/2006/wordml" xmlns:wps="http://schemas.microsoft.com/office/word/2010/wordprocessingShape" mc:Ignorable="w14 w15 w16se wp14">
   <w:body>
     <w:p>
       <w:pPr>
@@ -527,7 +527,7 @@
     <w:p>
       <w:pPr>
         <w:rPr>
-          <w:rFonts w:asciiTheme="minorHAnsi" w:eastAsiaTheme="minorHAnsi" w:hAnsiTheme="minorHAnsi" w:hint="eastAsia"/>
+          <w:rFonts w:asciiTheme="minorHAnsi" w:eastAsiaTheme="minorHAnsi" w:hAnsiTheme="minorHAnsi"/>
           <w:sz w:val="24"/>
           <w:szCs w:val="24"/>
         </w:rPr>
@@ -934,15 +934,7 @@
                 <w:sz w:val="24"/>
                 <w:szCs w:val="24"/>
               </w:rPr>
-              <w:t>⑤</w:t>
-            </w:r>
-            <w:r>
-              <w:rPr>
-                <w:rFonts w:asciiTheme="minorHAnsi" w:eastAsiaTheme="minorHAnsi" w:hAnsiTheme="minorHAnsi" w:cs="Consolas"/>
-                <w:sz w:val="24"/>
-                <w:szCs w:val="24"/>
-              </w:rPr>
-              <w:t xml:space="preserve"> 8192</w:t>
+              <w:t>⑤ 8192</w:t>
             </w:r>
           </w:p>
         </w:tc>
@@ -4918,7 +4910,49 @@
           <w:sz w:val="24"/>
           <w:szCs w:val="24"/>
         </w:rPr>
-        <w:t xml:space="preserve">모든 가능한 발표 순서를 알파벳 순서로 나열해보면 ABCDEF부터 FEDCBA까지 720가지가 있는데, 그 중 </w:t>
+        <w:t>모든 가능한 발표 순서를 알파벳 순서로 나열해보면 ABCDE부터</w:t>
+      </w:r>
+      <w:r>
+        <w:rPr>
+          <w:rFonts w:asciiTheme="minorHAnsi" w:eastAsiaTheme="minorHAnsi" w:hAnsiTheme="minorHAnsi" w:cs="Consolas" w:hint="eastAsia"/>
+          <w:sz w:val="24"/>
+          <w:szCs w:val="24"/>
+        </w:rPr>
+        <w:t xml:space="preserve"> </w:t>
+      </w:r>
+      <w:r>
+        <w:rPr>
+          <w:rFonts w:asciiTheme="minorHAnsi" w:eastAsiaTheme="minorHAnsi" w:hAnsiTheme="minorHAnsi" w:cs="Consolas" w:hint="eastAsia"/>
+          <w:sz w:val="24"/>
+          <w:szCs w:val="24"/>
+        </w:rPr>
+        <w:t>EDCBA까지</w:t>
+      </w:r>
+      <w:r>
+        <w:rPr>
+          <w:rFonts w:asciiTheme="minorHAnsi" w:eastAsiaTheme="minorHAnsi" w:hAnsiTheme="minorHAnsi" w:cs="Consolas" w:hint="eastAsia"/>
+          <w:sz w:val="24"/>
+          <w:szCs w:val="24"/>
+        </w:rPr>
+        <w:t xml:space="preserve"> </w:t>
+      </w:r>
+      <w:r>
+        <w:rPr>
+          <w:rFonts w:asciiTheme="minorHAnsi" w:eastAsiaTheme="minorHAnsi" w:hAnsiTheme="minorHAnsi" w:cs="Consolas"/>
+          <w:sz w:val="24"/>
+          <w:szCs w:val="24"/>
+        </w:rPr>
+        <w:t>1</w:t>
+      </w:r>
+      <w:bookmarkStart w:id="0" w:name="_GoBack"/>
+      <w:bookmarkEnd w:id="0"/>
+      <w:r>
+        <w:rPr>
+          <w:rFonts w:asciiTheme="minorHAnsi" w:eastAsiaTheme="minorHAnsi" w:hAnsiTheme="minorHAnsi" w:cs="Consolas" w:hint="eastAsia"/>
+          <w:sz w:val="24"/>
+          <w:szCs w:val="24"/>
+        </w:rPr>
+        <w:t xml:space="preserve">20가지가 있는데, 그 중 </w:t>
       </w:r>
       <w:r>
         <w:rPr>
@@ -6060,13 +6094,11 @@
     <w:p>
       <w:pPr>
         <w:rPr>
-          <w:rFonts w:asciiTheme="minorHAnsi" w:eastAsiaTheme="minorHAnsi" w:hAnsiTheme="minorHAnsi" w:cs="Consolas" w:hint="eastAsia"/>
-          <w:sz w:val="24"/>
-          <w:szCs w:val="24"/>
-        </w:rPr>
-      </w:pPr>
-      <w:bookmarkStart w:id="0" w:name="_GoBack"/>
-      <w:bookmarkEnd w:id="0"/>
+          <w:rFonts w:asciiTheme="minorHAnsi" w:eastAsiaTheme="minorHAnsi" w:hAnsiTheme="minorHAnsi" w:cs="Consolas"/>
+          <w:sz w:val="24"/>
+          <w:szCs w:val="24"/>
+        </w:rPr>
+      </w:pPr>
     </w:p>
     <w:p>
       <w:pPr>
@@ -6668,15 +6700,7 @@
                 <w:sz w:val="24"/>
                 <w:szCs w:val="24"/>
               </w:rPr>
-              <w:t xml:space="preserve">① </w:t>
-            </w:r>
-            <w:r>
-              <w:rPr>
-                <w:rFonts w:asciiTheme="minorHAnsi" w:eastAsiaTheme="minorHAnsi" w:hAnsiTheme="minorHAnsi" w:cs="Consolas"/>
-                <w:sz w:val="24"/>
-                <w:szCs w:val="24"/>
-              </w:rPr>
-              <w:t>6</w:t>
+              <w:t>① 6</w:t>
             </w:r>
           </w:p>
         </w:tc>
@@ -6715,16 +6739,7 @@
                 <w:sz w:val="24"/>
                 <w:szCs w:val="24"/>
               </w:rPr>
-              <w:t xml:space="preserve">② </w:t>
-            </w:r>
-            <w:r>
-              <w:rPr>
-                <w:rFonts w:asciiTheme="minorHAnsi" w:eastAsiaTheme="minorHAnsi" w:hAnsiTheme="minorHAnsi" w:cs="Consolas"/>
-                <w:bCs/>
-                <w:sz w:val="24"/>
-                <w:szCs w:val="24"/>
-              </w:rPr>
-              <w:t>7</w:t>
+              <w:t>② 7</w:t>
             </w:r>
           </w:p>
         </w:tc>
@@ -6761,15 +6776,7 @@
                 <w:sz w:val="24"/>
                 <w:szCs w:val="24"/>
               </w:rPr>
-              <w:t xml:space="preserve">③ </w:t>
-            </w:r>
-            <w:r>
-              <w:rPr>
-                <w:rFonts w:asciiTheme="minorHAnsi" w:eastAsiaTheme="minorHAnsi" w:hAnsiTheme="minorHAnsi" w:cs="Consolas"/>
-                <w:sz w:val="24"/>
-                <w:szCs w:val="24"/>
-              </w:rPr>
-              <w:t>8</w:t>
+              <w:t>③ 8</w:t>
             </w:r>
           </w:p>
         </w:tc>
@@ -6807,16 +6814,7 @@
                 <w:sz w:val="24"/>
                 <w:szCs w:val="24"/>
               </w:rPr>
-              <w:t xml:space="preserve">④ </w:t>
-            </w:r>
-            <w:r>
-              <w:rPr>
-                <w:rFonts w:asciiTheme="minorHAnsi" w:eastAsiaTheme="minorHAnsi" w:hAnsiTheme="minorHAnsi" w:cs="Consolas"/>
-                <w:color w:val="FF0000"/>
-                <w:sz w:val="24"/>
-                <w:szCs w:val="24"/>
-              </w:rPr>
-              <w:t>9</w:t>
+              <w:t>④ 9</w:t>
             </w:r>
           </w:p>
         </w:tc>
@@ -6854,7 +6852,7 @@
     <w:p>
       <w:pPr>
         <w:rPr>
-          <w:rFonts w:asciiTheme="minorHAnsi" w:eastAsiaTheme="minorHAnsi" w:hAnsiTheme="minorHAnsi" w:cs="Consolas" w:hint="eastAsia"/>
+          <w:rFonts w:asciiTheme="minorHAnsi" w:eastAsiaTheme="minorHAnsi" w:hAnsiTheme="minorHAnsi" w:cs="Consolas"/>
           <w:sz w:val="24"/>
           <w:szCs w:val="24"/>
         </w:rPr>
@@ -6878,7 +6876,7 @@
 </file>
 
 <file path=word/endnotes.xml><?xml version="1.0" encoding="utf-8"?>
-<w:endnotes xmlns:wpc="http://schemas.microsoft.com/office/word/2010/wordprocessingCanvas" xmlns:cx="http://schemas.microsoft.com/office/drawing/2014/chartex" xmlns:cx1="http://schemas.microsoft.com/office/drawing/2015/9/8/chartex" xmlns:mc="http://schemas.openxmlformats.org/markup-compatibility/2006" xmlns:o="urn:schemas-microsoft-com:office:office" xmlns:r="http://schemas.openxmlformats.org/officeDocument/2006/relationships" xmlns:m="http://schemas.openxmlformats.org/officeDocument/2006/math" xmlns:v="urn:schemas-microsoft-com:vml" xmlns:wp14="http://schemas.microsoft.com/office/word/2010/wordprocessingDrawing" xmlns:wp="http://schemas.openxmlformats.org/drawingml/2006/wordprocessingDrawing" xmlns:w10="urn:schemas-microsoft-com:office:word" xmlns:w="http://schemas.openxmlformats.org/wordprocessingml/2006/main" xmlns:w14="http://schemas.microsoft.com/office/word/2010/wordml" xmlns:w15="http://schemas.microsoft.com/office/word/2012/wordml" xmlns:w16se="http://schemas.microsoft.com/office/word/2015/wordml/symex" xmlns:wpg="http://schemas.microsoft.com/office/word/2010/wordprocessingGroup" xmlns:wpi="http://schemas.microsoft.com/office/word/2010/wordprocessingInk" xmlns:wne="http://schemas.microsoft.com/office/word/2006/wordml" xmlns:wps="http://schemas.microsoft.com/office/word/2010/wordprocessingShape" mc:Ignorable="w14 w15 w16se wp14">
+<w:endnotes xmlns:wpc="http://schemas.microsoft.com/office/word/2010/wordprocessingCanvas" xmlns:cx="http://schemas.microsoft.com/office/drawing/2014/chartex" xmlns:mc="http://schemas.openxmlformats.org/markup-compatibility/2006" xmlns:o="urn:schemas-microsoft-com:office:office" xmlns:r="http://schemas.openxmlformats.org/officeDocument/2006/relationships" xmlns:m="http://schemas.openxmlformats.org/officeDocument/2006/math" xmlns:v="urn:schemas-microsoft-com:vml" xmlns:wp14="http://schemas.microsoft.com/office/word/2010/wordprocessingDrawing" xmlns:wp="http://schemas.openxmlformats.org/drawingml/2006/wordprocessingDrawing" xmlns:w10="urn:schemas-microsoft-com:office:word" xmlns:w="http://schemas.openxmlformats.org/wordprocessingml/2006/main" xmlns:w14="http://schemas.microsoft.com/office/word/2010/wordml" xmlns:w15="http://schemas.microsoft.com/office/word/2012/wordml" xmlns:w16se="http://schemas.microsoft.com/office/word/2015/wordml/symex" xmlns:wpg="http://schemas.microsoft.com/office/word/2010/wordprocessingGroup" xmlns:wpi="http://schemas.microsoft.com/office/word/2010/wordprocessingInk" xmlns:wne="http://schemas.microsoft.com/office/word/2006/wordml" xmlns:wps="http://schemas.microsoft.com/office/word/2010/wordprocessingShape" mc:Ignorable="w14 w15 w16se wp14">
   <w:endnote w:type="separator" w:id="-1">
     <w:p>
       <w:pPr>
@@ -6903,7 +6901,7 @@
 </file>
 
 <file path=word/footer1.xml><?xml version="1.0" encoding="utf-8"?>
-<w:ftr xmlns:wpc="http://schemas.microsoft.com/office/word/2010/wordprocessingCanvas" xmlns:cx="http://schemas.microsoft.com/office/drawing/2014/chartex" xmlns:cx1="http://schemas.microsoft.com/office/drawing/2015/9/8/chartex" xmlns:mc="http://schemas.openxmlformats.org/markup-compatibility/2006" xmlns:o="urn:schemas-microsoft-com:office:office" xmlns:r="http://schemas.openxmlformats.org/officeDocument/2006/relationships" xmlns:m="http://schemas.openxmlformats.org/officeDocument/2006/math" xmlns:v="urn:schemas-microsoft-com:vml" xmlns:wp14="http://schemas.microsoft.com/office/word/2010/wordprocessingDrawing" xmlns:wp="http://schemas.openxmlformats.org/drawingml/2006/wordprocessingDrawing" xmlns:w10="urn:schemas-microsoft-com:office:word" xmlns:w="http://schemas.openxmlformats.org/wordprocessingml/2006/main" xmlns:w14="http://schemas.microsoft.com/office/word/2010/wordml" xmlns:w15="http://schemas.microsoft.com/office/word/2012/wordml" xmlns:w16se="http://schemas.microsoft.com/office/word/2015/wordml/symex" xmlns:wpg="http://schemas.microsoft.com/office/word/2010/wordprocessingGroup" xmlns:wpi="http://schemas.microsoft.com/office/word/2010/wordprocessingInk" xmlns:wne="http://schemas.microsoft.com/office/word/2006/wordml" xmlns:wps="http://schemas.microsoft.com/office/word/2010/wordprocessingShape" mc:Ignorable="w14 w15 w16se wp14">
+<w:ftr xmlns:wpc="http://schemas.microsoft.com/office/word/2010/wordprocessingCanvas" xmlns:cx="http://schemas.microsoft.com/office/drawing/2014/chartex" xmlns:mc="http://schemas.openxmlformats.org/markup-compatibility/2006" xmlns:o="urn:schemas-microsoft-com:office:office" xmlns:r="http://schemas.openxmlformats.org/officeDocument/2006/relationships" xmlns:m="http://schemas.openxmlformats.org/officeDocument/2006/math" xmlns:v="urn:schemas-microsoft-com:vml" xmlns:wp14="http://schemas.microsoft.com/office/word/2010/wordprocessingDrawing" xmlns:wp="http://schemas.openxmlformats.org/drawingml/2006/wordprocessingDrawing" xmlns:w10="urn:schemas-microsoft-com:office:word" xmlns:w="http://schemas.openxmlformats.org/wordprocessingml/2006/main" xmlns:w14="http://schemas.microsoft.com/office/word/2010/wordml" xmlns:w15="http://schemas.microsoft.com/office/word/2012/wordml" xmlns:w16se="http://schemas.microsoft.com/office/word/2015/wordml/symex" xmlns:wpg="http://schemas.microsoft.com/office/word/2010/wordprocessingGroup" xmlns:wpi="http://schemas.microsoft.com/office/word/2010/wordprocessingInk" xmlns:wne="http://schemas.microsoft.com/office/word/2006/wordml" xmlns:wps="http://schemas.microsoft.com/office/word/2010/wordprocessingShape" mc:Ignorable="w14 w15 w16se wp14">
   <w:p>
     <w:pPr>
       <w:pStyle w:val="a4"/>
@@ -7106,7 +7104,7 @@
 </file>
 
 <file path=word/footer2.xml><?xml version="1.0" encoding="utf-8"?>
-<w:ftr xmlns:wpc="http://schemas.microsoft.com/office/word/2010/wordprocessingCanvas" xmlns:cx="http://schemas.microsoft.com/office/drawing/2014/chartex" xmlns:cx1="http://schemas.microsoft.com/office/drawing/2015/9/8/chartex" xmlns:mc="http://schemas.openxmlformats.org/markup-compatibility/2006" xmlns:o="urn:schemas-microsoft-com:office:office" xmlns:r="http://schemas.openxmlformats.org/officeDocument/2006/relationships" xmlns:m="http://schemas.openxmlformats.org/officeDocument/2006/math" xmlns:v="urn:schemas-microsoft-com:vml" xmlns:wp14="http://schemas.microsoft.com/office/word/2010/wordprocessingDrawing" xmlns:wp="http://schemas.openxmlformats.org/drawingml/2006/wordprocessingDrawing" xmlns:w10="urn:schemas-microsoft-com:office:word" xmlns:w="http://schemas.openxmlformats.org/wordprocessingml/2006/main" xmlns:w14="http://schemas.microsoft.com/office/word/2010/wordml" xmlns:w15="http://schemas.microsoft.com/office/word/2012/wordml" xmlns:w16se="http://schemas.microsoft.com/office/word/2015/wordml/symex" xmlns:wpg="http://schemas.microsoft.com/office/word/2010/wordprocessingGroup" xmlns:wpi="http://schemas.microsoft.com/office/word/2010/wordprocessingInk" xmlns:wne="http://schemas.microsoft.com/office/word/2006/wordml" xmlns:wps="http://schemas.microsoft.com/office/word/2010/wordprocessingShape" mc:Ignorable="w14 w15 w16se wp14">
+<w:ftr xmlns:wpc="http://schemas.microsoft.com/office/word/2010/wordprocessingCanvas" xmlns:cx="http://schemas.microsoft.com/office/drawing/2014/chartex" xmlns:mc="http://schemas.openxmlformats.org/markup-compatibility/2006" xmlns:o="urn:schemas-microsoft-com:office:office" xmlns:r="http://schemas.openxmlformats.org/officeDocument/2006/relationships" xmlns:m="http://schemas.openxmlformats.org/officeDocument/2006/math" xmlns:v="urn:schemas-microsoft-com:vml" xmlns:wp14="http://schemas.microsoft.com/office/word/2010/wordprocessingDrawing" xmlns:wp="http://schemas.openxmlformats.org/drawingml/2006/wordprocessingDrawing" xmlns:w10="urn:schemas-microsoft-com:office:word" xmlns:w="http://schemas.openxmlformats.org/wordprocessingml/2006/main" xmlns:w14="http://schemas.microsoft.com/office/word/2010/wordml" xmlns:w15="http://schemas.microsoft.com/office/word/2012/wordml" xmlns:w16se="http://schemas.microsoft.com/office/word/2015/wordml/symex" xmlns:wpg="http://schemas.microsoft.com/office/word/2010/wordprocessingGroup" xmlns:wpi="http://schemas.microsoft.com/office/word/2010/wordprocessingInk" xmlns:wne="http://schemas.microsoft.com/office/word/2006/wordml" xmlns:wps="http://schemas.microsoft.com/office/word/2010/wordprocessingShape" mc:Ignorable="w14 w15 w16se wp14">
   <w:p>
     <w:pPr>
       <w:pStyle w:val="a4"/>
@@ -7308,7 +7306,7 @@
 </file>
 
 <file path=word/footer3.xml><?xml version="1.0" encoding="utf-8"?>
-<w:ftr xmlns:wpc="http://schemas.microsoft.com/office/word/2010/wordprocessingCanvas" xmlns:cx="http://schemas.microsoft.com/office/drawing/2014/chartex" xmlns:cx1="http://schemas.microsoft.com/office/drawing/2015/9/8/chartex" xmlns:mc="http://schemas.openxmlformats.org/markup-compatibility/2006" xmlns:o="urn:schemas-microsoft-com:office:office" xmlns:r="http://schemas.openxmlformats.org/officeDocument/2006/relationships" xmlns:m="http://schemas.openxmlformats.org/officeDocument/2006/math" xmlns:v="urn:schemas-microsoft-com:vml" xmlns:wp14="http://schemas.microsoft.com/office/word/2010/wordprocessingDrawing" xmlns:wp="http://schemas.openxmlformats.org/drawingml/2006/wordprocessingDrawing" xmlns:w10="urn:schemas-microsoft-com:office:word" xmlns:w="http://schemas.openxmlformats.org/wordprocessingml/2006/main" xmlns:w14="http://schemas.microsoft.com/office/word/2010/wordml" xmlns:w15="http://schemas.microsoft.com/office/word/2012/wordml" xmlns:w16se="http://schemas.microsoft.com/office/word/2015/wordml/symex" xmlns:wpg="http://schemas.microsoft.com/office/word/2010/wordprocessingGroup" xmlns:wpi="http://schemas.microsoft.com/office/word/2010/wordprocessingInk" xmlns:wne="http://schemas.microsoft.com/office/word/2006/wordml" xmlns:wps="http://schemas.microsoft.com/office/word/2010/wordprocessingShape" mc:Ignorable="w14 w15 w16se wp14">
+<w:ftr xmlns:wpc="http://schemas.microsoft.com/office/word/2010/wordprocessingCanvas" xmlns:cx="http://schemas.microsoft.com/office/drawing/2014/chartex" xmlns:mc="http://schemas.openxmlformats.org/markup-compatibility/2006" xmlns:o="urn:schemas-microsoft-com:office:office" xmlns:r="http://schemas.openxmlformats.org/officeDocument/2006/relationships" xmlns:m="http://schemas.openxmlformats.org/officeDocument/2006/math" xmlns:v="urn:schemas-microsoft-com:vml" xmlns:wp14="http://schemas.microsoft.com/office/word/2010/wordprocessingDrawing" xmlns:wp="http://schemas.openxmlformats.org/drawingml/2006/wordprocessingDrawing" xmlns:w10="urn:schemas-microsoft-com:office:word" xmlns:w="http://schemas.openxmlformats.org/wordprocessingml/2006/main" xmlns:w14="http://schemas.microsoft.com/office/word/2010/wordml" xmlns:w15="http://schemas.microsoft.com/office/word/2012/wordml" xmlns:w16se="http://schemas.microsoft.com/office/word/2015/wordml/symex" xmlns:wpg="http://schemas.microsoft.com/office/word/2010/wordprocessingGroup" xmlns:wpi="http://schemas.microsoft.com/office/word/2010/wordprocessingInk" xmlns:wne="http://schemas.microsoft.com/office/word/2006/wordml" xmlns:wps="http://schemas.microsoft.com/office/word/2010/wordprocessingShape" mc:Ignorable="w14 w15 w16se wp14">
   <w:p>
     <w:pPr>
       <w:pStyle w:val="a4"/>
@@ -7318,7 +7316,7 @@
 </file>
 
 <file path=word/footnotes.xml><?xml version="1.0" encoding="utf-8"?>
-<w:footnotes xmlns:wpc="http://schemas.microsoft.com/office/word/2010/wordprocessingCanvas" xmlns:cx="http://schemas.microsoft.com/office/drawing/2014/chartex" xmlns:cx1="http://schemas.microsoft.com/office/drawing/2015/9/8/chartex" xmlns:mc="http://schemas.openxmlformats.org/markup-compatibility/2006" xmlns:o="urn:schemas-microsoft-com:office:office" xmlns:r="http://schemas.openxmlformats.org/officeDocument/2006/relationships" xmlns:m="http://schemas.openxmlformats.org/officeDocument/2006/math" xmlns:v="urn:schemas-microsoft-com:vml" xmlns:wp14="http://schemas.microsoft.com/office/word/2010/wordprocessingDrawing" xmlns:wp="http://schemas.openxmlformats.org/drawingml/2006/wordprocessingDrawing" xmlns:w10="urn:schemas-microsoft-com:office:word" xmlns:w="http://schemas.openxmlformats.org/wordprocessingml/2006/main" xmlns:w14="http://schemas.microsoft.com/office/word/2010/wordml" xmlns:w15="http://schemas.microsoft.com/office/word/2012/wordml" xmlns:w16se="http://schemas.microsoft.com/office/word/2015/wordml/symex" xmlns:wpg="http://schemas.microsoft.com/office/word/2010/wordprocessingGroup" xmlns:wpi="http://schemas.microsoft.com/office/word/2010/wordprocessingInk" xmlns:wne="http://schemas.microsoft.com/office/word/2006/wordml" xmlns:wps="http://schemas.microsoft.com/office/word/2010/wordprocessingShape" mc:Ignorable="w14 w15 w16se wp14">
+<w:footnotes xmlns:wpc="http://schemas.microsoft.com/office/word/2010/wordprocessingCanvas" xmlns:cx="http://schemas.microsoft.com/office/drawing/2014/chartex" xmlns:mc="http://schemas.openxmlformats.org/markup-compatibility/2006" xmlns:o="urn:schemas-microsoft-com:office:office" xmlns:r="http://schemas.openxmlformats.org/officeDocument/2006/relationships" xmlns:m="http://schemas.openxmlformats.org/officeDocument/2006/math" xmlns:v="urn:schemas-microsoft-com:vml" xmlns:wp14="http://schemas.microsoft.com/office/word/2010/wordprocessingDrawing" xmlns:wp="http://schemas.openxmlformats.org/drawingml/2006/wordprocessingDrawing" xmlns:w10="urn:schemas-microsoft-com:office:word" xmlns:w="http://schemas.openxmlformats.org/wordprocessingml/2006/main" xmlns:w14="http://schemas.microsoft.com/office/word/2010/wordml" xmlns:w15="http://schemas.microsoft.com/office/word/2012/wordml" xmlns:w16se="http://schemas.microsoft.com/office/word/2015/wordml/symex" xmlns:wpg="http://schemas.microsoft.com/office/word/2010/wordprocessingGroup" xmlns:wpi="http://schemas.microsoft.com/office/word/2010/wordprocessingInk" xmlns:wne="http://schemas.microsoft.com/office/word/2006/wordml" xmlns:wps="http://schemas.microsoft.com/office/word/2010/wordprocessingShape" mc:Ignorable="w14 w15 w16se wp14">
   <w:footnote w:type="separator" w:id="-1">
     <w:p>
       <w:pPr>
@@ -7343,7 +7341,7 @@
 </file>
 
 <file path=word/header1.xml><?xml version="1.0" encoding="utf-8"?>
-<w:hdr xmlns:wpc="http://schemas.microsoft.com/office/word/2010/wordprocessingCanvas" xmlns:cx="http://schemas.microsoft.com/office/drawing/2014/chartex" xmlns:cx1="http://schemas.microsoft.com/office/drawing/2015/9/8/chartex" xmlns:mc="http://schemas.openxmlformats.org/markup-compatibility/2006" xmlns:o="urn:schemas-microsoft-com:office:office" xmlns:r="http://schemas.openxmlformats.org/officeDocument/2006/relationships" xmlns:m="http://schemas.openxmlformats.org/officeDocument/2006/math" xmlns:v="urn:schemas-microsoft-com:vml" xmlns:wp14="http://schemas.microsoft.com/office/word/2010/wordprocessingDrawing" xmlns:wp="http://schemas.openxmlformats.org/drawingml/2006/wordprocessingDrawing" xmlns:w10="urn:schemas-microsoft-com:office:word" xmlns:w="http://schemas.openxmlformats.org/wordprocessingml/2006/main" xmlns:w14="http://schemas.microsoft.com/office/word/2010/wordml" xmlns:w15="http://schemas.microsoft.com/office/word/2012/wordml" xmlns:w16se="http://schemas.microsoft.com/office/word/2015/wordml/symex" xmlns:wpg="http://schemas.microsoft.com/office/word/2010/wordprocessingGroup" xmlns:wpi="http://schemas.microsoft.com/office/word/2010/wordprocessingInk" xmlns:wne="http://schemas.microsoft.com/office/word/2006/wordml" xmlns:wps="http://schemas.microsoft.com/office/word/2010/wordprocessingShape" mc:Ignorable="w14 w15 w16se wp14">
+<w:hdr xmlns:wpc="http://schemas.microsoft.com/office/word/2010/wordprocessingCanvas" xmlns:cx="http://schemas.microsoft.com/office/drawing/2014/chartex" xmlns:mc="http://schemas.openxmlformats.org/markup-compatibility/2006" xmlns:o="urn:schemas-microsoft-com:office:office" xmlns:r="http://schemas.openxmlformats.org/officeDocument/2006/relationships" xmlns:m="http://schemas.openxmlformats.org/officeDocument/2006/math" xmlns:v="urn:schemas-microsoft-com:vml" xmlns:wp14="http://schemas.microsoft.com/office/word/2010/wordprocessingDrawing" xmlns:wp="http://schemas.openxmlformats.org/drawingml/2006/wordprocessingDrawing" xmlns:w10="urn:schemas-microsoft-com:office:word" xmlns:w="http://schemas.openxmlformats.org/wordprocessingml/2006/main" xmlns:w14="http://schemas.microsoft.com/office/word/2010/wordml" xmlns:w15="http://schemas.microsoft.com/office/word/2012/wordml" xmlns:w16se="http://schemas.microsoft.com/office/word/2015/wordml/symex" xmlns:wpg="http://schemas.microsoft.com/office/word/2010/wordprocessingGroup" xmlns:wpi="http://schemas.microsoft.com/office/word/2010/wordprocessingInk" xmlns:wne="http://schemas.microsoft.com/office/word/2006/wordml" xmlns:wps="http://schemas.microsoft.com/office/word/2010/wordprocessingShape" mc:Ignorable="w14 w15 w16se wp14">
   <w:p>
     <w:pPr>
       <w:pStyle w:val="a3"/>
@@ -7380,7 +7378,7 @@
 </file>
 
 <file path=word/header2.xml><?xml version="1.0" encoding="utf-8"?>
-<w:hdr xmlns:wpc="http://schemas.microsoft.com/office/word/2010/wordprocessingCanvas" xmlns:cx="http://schemas.microsoft.com/office/drawing/2014/chartex" xmlns:cx1="http://schemas.microsoft.com/office/drawing/2015/9/8/chartex" xmlns:mc="http://schemas.openxmlformats.org/markup-compatibility/2006" xmlns:o="urn:schemas-microsoft-com:office:office" xmlns:r="http://schemas.openxmlformats.org/officeDocument/2006/relationships" xmlns:m="http://schemas.openxmlformats.org/officeDocument/2006/math" xmlns:v="urn:schemas-microsoft-com:vml" xmlns:wp14="http://schemas.microsoft.com/office/word/2010/wordprocessingDrawing" xmlns:wp="http://schemas.openxmlformats.org/drawingml/2006/wordprocessingDrawing" xmlns:w10="urn:schemas-microsoft-com:office:word" xmlns:w="http://schemas.openxmlformats.org/wordprocessingml/2006/main" xmlns:w14="http://schemas.microsoft.com/office/word/2010/wordml" xmlns:w15="http://schemas.microsoft.com/office/word/2012/wordml" xmlns:w16se="http://schemas.microsoft.com/office/word/2015/wordml/symex" xmlns:wpg="http://schemas.microsoft.com/office/word/2010/wordprocessingGroup" xmlns:wpi="http://schemas.microsoft.com/office/word/2010/wordprocessingInk" xmlns:wne="http://schemas.microsoft.com/office/word/2006/wordml" xmlns:wps="http://schemas.microsoft.com/office/word/2010/wordprocessingShape" mc:Ignorable="w14 w15 w16se wp14">
+<w:hdr xmlns:wpc="http://schemas.microsoft.com/office/word/2010/wordprocessingCanvas" xmlns:cx="http://schemas.microsoft.com/office/drawing/2014/chartex" xmlns:mc="http://schemas.openxmlformats.org/markup-compatibility/2006" xmlns:o="urn:schemas-microsoft-com:office:office" xmlns:r="http://schemas.openxmlformats.org/officeDocument/2006/relationships" xmlns:m="http://schemas.openxmlformats.org/officeDocument/2006/math" xmlns:v="urn:schemas-microsoft-com:vml" xmlns:wp14="http://schemas.microsoft.com/office/word/2010/wordprocessingDrawing" xmlns:wp="http://schemas.openxmlformats.org/drawingml/2006/wordprocessingDrawing" xmlns:w10="urn:schemas-microsoft-com:office:word" xmlns:w="http://schemas.openxmlformats.org/wordprocessingml/2006/main" xmlns:w14="http://schemas.microsoft.com/office/word/2010/wordml" xmlns:w15="http://schemas.microsoft.com/office/word/2012/wordml" xmlns:w16se="http://schemas.microsoft.com/office/word/2015/wordml/symex" xmlns:wpg="http://schemas.microsoft.com/office/word/2010/wordprocessingGroup" xmlns:wpi="http://schemas.microsoft.com/office/word/2010/wordprocessingInk" xmlns:wne="http://schemas.microsoft.com/office/word/2006/wordml" xmlns:wps="http://schemas.microsoft.com/office/word/2010/wordprocessingShape" mc:Ignorable="w14 w15 w16se wp14">
   <w:p>
     <w:pPr>
       <w:pStyle w:val="a3"/>
@@ -7477,7 +7475,7 @@
 </file>
 
 <file path=word/header3.xml><?xml version="1.0" encoding="utf-8"?>
-<w:hdr xmlns:wpc="http://schemas.microsoft.com/office/word/2010/wordprocessingCanvas" xmlns:cx="http://schemas.microsoft.com/office/drawing/2014/chartex" xmlns:cx1="http://schemas.microsoft.com/office/drawing/2015/9/8/chartex" xmlns:mc="http://schemas.openxmlformats.org/markup-compatibility/2006" xmlns:o="urn:schemas-microsoft-com:office:office" xmlns:r="http://schemas.openxmlformats.org/officeDocument/2006/relationships" xmlns:m="http://schemas.openxmlformats.org/officeDocument/2006/math" xmlns:v="urn:schemas-microsoft-com:vml" xmlns:wp14="http://schemas.microsoft.com/office/word/2010/wordprocessingDrawing" xmlns:wp="http://schemas.openxmlformats.org/drawingml/2006/wordprocessingDrawing" xmlns:w10="urn:schemas-microsoft-com:office:word" xmlns:w="http://schemas.openxmlformats.org/wordprocessingml/2006/main" xmlns:w14="http://schemas.microsoft.com/office/word/2010/wordml" xmlns:w15="http://schemas.microsoft.com/office/word/2012/wordml" xmlns:w16se="http://schemas.microsoft.com/office/word/2015/wordml/symex" xmlns:wpg="http://schemas.microsoft.com/office/word/2010/wordprocessingGroup" xmlns:wpi="http://schemas.microsoft.com/office/word/2010/wordprocessingInk" xmlns:wne="http://schemas.microsoft.com/office/word/2006/wordml" xmlns:wps="http://schemas.microsoft.com/office/word/2010/wordprocessingShape" mc:Ignorable="w14 w15 w16se wp14">
+<w:hdr xmlns:wpc="http://schemas.microsoft.com/office/word/2010/wordprocessingCanvas" xmlns:cx="http://schemas.microsoft.com/office/drawing/2014/chartex" xmlns:mc="http://schemas.openxmlformats.org/markup-compatibility/2006" xmlns:o="urn:schemas-microsoft-com:office:office" xmlns:r="http://schemas.openxmlformats.org/officeDocument/2006/relationships" xmlns:m="http://schemas.openxmlformats.org/officeDocument/2006/math" xmlns:v="urn:schemas-microsoft-com:vml" xmlns:wp14="http://schemas.microsoft.com/office/word/2010/wordprocessingDrawing" xmlns:wp="http://schemas.openxmlformats.org/drawingml/2006/wordprocessingDrawing" xmlns:w10="urn:schemas-microsoft-com:office:word" xmlns:w="http://schemas.openxmlformats.org/wordprocessingml/2006/main" xmlns:w14="http://schemas.microsoft.com/office/word/2010/wordml" xmlns:w15="http://schemas.microsoft.com/office/word/2012/wordml" xmlns:w16se="http://schemas.microsoft.com/office/word/2015/wordml/symex" xmlns:wpg="http://schemas.microsoft.com/office/word/2010/wordprocessingGroup" xmlns:wpi="http://schemas.microsoft.com/office/word/2010/wordprocessingInk" xmlns:wne="http://schemas.microsoft.com/office/word/2006/wordml" xmlns:wps="http://schemas.microsoft.com/office/word/2010/wordprocessingShape" mc:Ignorable="w14 w15 w16se wp14">
   <w:p>
     <w:pPr>
       <w:pStyle w:val="a3"/>
@@ -7487,7 +7485,7 @@
 </file>
 
 <file path=word/numbering.xml><?xml version="1.0" encoding="utf-8"?>
-<w:numbering xmlns:wpc="http://schemas.microsoft.com/office/word/2010/wordprocessingCanvas" xmlns:cx="http://schemas.microsoft.com/office/drawing/2014/chartex" xmlns:cx1="http://schemas.microsoft.com/office/drawing/2015/9/8/chartex" xmlns:mc="http://schemas.openxmlformats.org/markup-compatibility/2006" xmlns:o="urn:schemas-microsoft-com:office:office" xmlns:r="http://schemas.openxmlformats.org/officeDocument/2006/relationships" xmlns:m="http://schemas.openxmlformats.org/officeDocument/2006/math" xmlns:v="urn:schemas-microsoft-com:vml" xmlns:wp14="http://schemas.microsoft.com/office/word/2010/wordprocessingDrawing" xmlns:wp="http://schemas.openxmlformats.org/drawingml/2006/wordprocessingDrawing" xmlns:w10="urn:schemas-microsoft-com:office:word" xmlns:w="http://schemas.openxmlformats.org/wordprocessingml/2006/main" xmlns:w14="http://schemas.microsoft.com/office/word/2010/wordml" xmlns:w15="http://schemas.microsoft.com/office/word/2012/wordml" xmlns:w16se="http://schemas.microsoft.com/office/word/2015/wordml/symex" xmlns:wpg="http://schemas.microsoft.com/office/word/2010/wordprocessingGroup" xmlns:wpi="http://schemas.microsoft.com/office/word/2010/wordprocessingInk" xmlns:wne="http://schemas.microsoft.com/office/word/2006/wordml" xmlns:wps="http://schemas.microsoft.com/office/word/2010/wordprocessingShape" mc:Ignorable="w14 w15 w16se wp14">
+<w:numbering xmlns:wpc="http://schemas.microsoft.com/office/word/2010/wordprocessingCanvas" xmlns:cx="http://schemas.microsoft.com/office/drawing/2014/chartex" xmlns:mc="http://schemas.openxmlformats.org/markup-compatibility/2006" xmlns:o="urn:schemas-microsoft-com:office:office" xmlns:r="http://schemas.openxmlformats.org/officeDocument/2006/relationships" xmlns:m="http://schemas.openxmlformats.org/officeDocument/2006/math" xmlns:v="urn:schemas-microsoft-com:vml" xmlns:wp14="http://schemas.microsoft.com/office/word/2010/wordprocessingDrawing" xmlns:wp="http://schemas.openxmlformats.org/drawingml/2006/wordprocessingDrawing" xmlns:w10="urn:schemas-microsoft-com:office:word" xmlns:w="http://schemas.openxmlformats.org/wordprocessingml/2006/main" xmlns:w14="http://schemas.microsoft.com/office/word/2010/wordml" xmlns:w15="http://schemas.microsoft.com/office/word/2012/wordml" xmlns:w16se="http://schemas.microsoft.com/office/word/2015/wordml/symex" xmlns:wpg="http://schemas.microsoft.com/office/word/2010/wordprocessingGroup" xmlns:wpi="http://schemas.microsoft.com/office/word/2010/wordprocessingInk" xmlns:wne="http://schemas.microsoft.com/office/word/2006/wordml" xmlns:wps="http://schemas.microsoft.com/office/word/2010/wordprocessingShape" mc:Ignorable="w14 w15 w16se wp14">
   <w:abstractNum w:abstractNumId="0" w15:restartNumberingAfterBreak="0">
     <w:nsid w:val="05443210"/>
     <w:multiLevelType w:val="multilevel"/>

</xml_diff>